<commit_message>
Add BigQuery analytics agents and show Cognizant as employer.
Feature iCABS, Cognos, and service-line agents, list Cognizant from Aug 2024 with Amex and Rentokil as clients, and keep Expedia in the UK.

Co-authored-by: Cursor <cursoragent@cursor.com>
</commit_message>
<xml_diff>
--- a/public/Dwarakanath_Cloud_AI_Resume_Updated.docx
+++ b/public/Dwarakanath_Cloud_AI_Resume_Updated.docx
@@ -73,7 +73,7 @@
           <w:sz w:val="21"/>
           <w:szCs w:val="21"/>
         </w:rPr>
-        <w:t>Senior Backend Software Engineer and GCP Cloud Developer with 10+ years of experience across backend development, event-driven microservices, and cloud/AI engineering, including 4+ years of hands-on Golang and 6+ years in Java/J2EE. Builds high-throughput distributed systems with Go, Kafka, RabbitMQ, PostgreSQL, Redis, and Docker/Kubernetes for regulated platforms in financial services, travel, and FMCG. Currently designs production AI platforms on GCP using Vertex AI, Gemini, Agent Engine, Document AI, RAG, BigQuery, Cloud Run, Pub/Sub, and Terraform across document intelligence, sales prioritisation, and cash allocation. Comfortable working across time zones and contributing to architecture, code quality, observability, and delivery.</w:t>
+        <w:t>Senior Backend Software Engineer and GCP Cloud Developer with 10+ years of experience across backend development, event-driven microservices, and cloud/AI engineering, including 4+ years of hands-on Golang and 6+ years in Java/J2EE. Builds high-throughput distributed systems with Go, Kafka, RabbitMQ, PostgreSQL, Redis, and Docker/Kubernetes for regulated platforms in financial services, travel, and FMCG. Currently employed by Cognizant (from 08/2024) and designs production AI platforms on GCP for Rentokil Initial using Vertex AI, Gemini, Agent Engine, Document AI, RAG, BigQuery Conversational Analytics, Cloud Run, Pub/Sub, and Terraform across document intelligence, sales prioritisation, cash allocation, and natural-language analytics over portfolio, financial, and service-line data. Previously delivered Golang loyalty services for American Express on the same Cognizant engagement. Comfortable working across time zones and contributing to architecture, code quality, observability, and delivery.</w:t>
       </w:r>
     </w:p>
     <w:p>
@@ -210,7 +210,7 @@
           <w:sz w:val="21"/>
           <w:szCs w:val="21"/>
         </w:rPr>
-        <w:t>AI &amp; Data: Agentic AI, RAG, Vertex AI, Agent Engine, Gemini, Google ADK, Document AI, machine learning, LLM inference (vLLM, Gemma), BigQuery SQL, QlikCloud</w:t>
+        <w:t>AI &amp; Data: Agentic AI, RAG, Vertex AI, Agent Engine, Gemini, Google ADK, Document AI, Conversational Analytics, machine learning, LLM inference (vLLM, Gemma), BigQuery SQL, QlikCloud</w:t>
       </w:r>
     </w:p>
     <w:p>
@@ -309,6 +309,30 @@
     </w:p>
     <w:p>
       <w:pPr>
+        <w:pBdr>
+          <w:bottom w:val="single" w:color="1F3864" w:sz="6" w:space="2"/>
+        </w:pBdr>
+        <w:spacing w:before="260" w:after="100"/>
+      </w:pPr>
+      <w:r>
+        <w:rPr>
+          <w:b/>
+          <w:color w:val="1F3864"/>
+          <w:sz w:val="22"/>
+        </w:rPr>
+        <w:t>Cognizant, UK</w:t>
+      </w:r>
+      <w:r>
+        <w:rPr>
+          <w:b w:val="0"/>
+          <w:color w:val="444444"/>
+          <w:sz w:val="20"/>
+        </w:rPr>
+        <w:t xml:space="preserve">  |  08/2024 to current</w:t>
+      </w:r>
+    </w:p>
+    <w:p>
+      <w:pPr>
         <w:keepNext/>
         <w:spacing w:before="180" w:after="20"/>
       </w:pPr>
@@ -319,7 +343,7 @@
           <w:sz w:val="22"/>
           <w:szCs w:val="22"/>
         </w:rPr>
-        <w:t>Project 1: Cloud &amp; AI Platform Engineering - Rentokil Initial, UK</w:t>
+        <w:t>Project 1: Cloud &amp; AI Platform Engineering - Client: Rentokil Initial, UK (current)</w:t>
       </w:r>
       <w:r>
         <w:rPr>
@@ -543,6 +567,78 @@
         <w:rPr>
           <w:b/>
           <w:sz w:val="21"/>
+        </w:rPr>
+        <w:t xml:space="preserve">iCABS Portfolio Agent: </w:t>
+      </w:r>
+      <w:r>
+        <w:rPr>
+          <w:b w:val="0"/>
+          <w:sz w:val="21"/>
+        </w:rPr>
+        <w:t>Published a BigQuery Conversational Analytics agent over monthly iCABS portfolio snapshots so Group Strategy can ask where new sales and live value land by sector and country, without a manual extract.</w:t>
+      </w:r>
+    </w:p>
+    <w:p>
+      <w:pPr>
+        <w:pStyle w:val="16"/>
+        <w:numPr>
+          <w:ilvl w:val="0"/>
+          <w:numId w:val="1"/>
+        </w:numPr>
+        <w:spacing w:after="60"/>
+      </w:pPr>
+      <w:r>
+        <w:rPr>
+          <w:b/>
+          <w:sz w:val="21"/>
+        </w:rPr>
+        <w:t xml:space="preserve">Cognos Financial Performance Agent: </w:t>
+      </w:r>
+      <w:r>
+        <w:rPr>
+          <w:b w:val="0"/>
+          <w:sz w:val="21"/>
+        </w:rPr>
+        <w:t>Landed mapped Cognos P&amp;L in BigQuery and built natural-language Q&amp;A for Europe revenue, profit, and margin by country and business line, replacing recurring Excel pivots.</w:t>
+      </w:r>
+    </w:p>
+    <w:p>
+      <w:pPr>
+        <w:pStyle w:val="16"/>
+        <w:numPr>
+          <w:ilvl w:val="0"/>
+          <w:numId w:val="1"/>
+        </w:numPr>
+        <w:spacing w:after="60"/>
+      </w:pPr>
+      <w:r>
+        <w:rPr>
+          <w:b/>
+          <w:sz w:val="21"/>
+        </w:rPr>
+        <w:t xml:space="preserve">Service Line Penetration Agent: </w:t>
+      </w:r>
+      <w:r>
+        <w:rPr>
+          <w:b w:val="0"/>
+          <w:sz w:val="21"/>
+        </w:rPr>
+        <w:t>Built a Europe cross-sell agent that classifies customers as pest only, hygiene only, or both, by country and sector, from monthly service-line snapshots rather than campaign rates.</w:t>
+      </w:r>
+    </w:p>
+    <w:p>
+      <w:pPr>
+        <w:pStyle w:val="16"/>
+        <w:numPr>
+          <w:ilvl w:val="0"/>
+          <w:numId w:val="1"/>
+        </w:numPr>
+        <w:spacing w:after="60"/>
+      </w:pPr>
+      <w:r>
+        <w:rPr>
+          <w:b/>
+          <w:sz w:val="21"/>
           <w:szCs w:val="21"/>
         </w:rPr>
         <w:t xml:space="preserve">LLM Inference PoC: </w:t>
@@ -616,7 +712,7 @@
           <w:sz w:val="22"/>
           <w:szCs w:val="22"/>
         </w:rPr>
-        <w:t>Project 2: Global Loyalty Program - Amex, UK</w:t>
+        <w:t>Project 2: Global Loyalty Program - Client: American Express, UK</w:t>
       </w:r>
       <w:r>
         <w:rPr>
@@ -820,7 +916,7 @@
           <w:sz w:val="22"/>
           <w:szCs w:val="22"/>
         </w:rPr>
-        <w:t>Project 3: Campaign Scheduler - Expedia, US</w:t>
+        <w:t>Project 3: Campaign Scheduler - Expedia, UK</w:t>
       </w:r>
       <w:r>
         <w:rPr>

</xml_diff>